<commit_message>
Documents: appendix resynced after the review rounds (primes in subscripts, 1,694 or 1,695, rank-criterion captions)
Co-Authored-By: Claude Fable 5.1 <noreply@anthropic.com>
</commit_message>
<xml_diff>
--- a/document/APPENDIX.docx
+++ b/document/APPENDIX.docx
@@ -4858,7 +4858,7 @@
                   <w:rPr>
                     <w:rFonts w:ascii="Cambria Math" w:hAnsi="Cambria Math"/>
                   </w:rPr>
-                  <m:t xml:space="preserve">v</m:t>
+                  <m:t xml:space="preserve">v′</m:t>
                 </m:r>
               </m:sub>
             </m:sSub>
@@ -4866,7 +4866,7 @@
               <w:rPr>
                 <w:rFonts w:ascii="Cambria Math" w:hAnsi="Cambria Math"/>
               </w:rPr>
-              <m:t xml:space="preserve">′)</m:t>
+              <m:t xml:space="preserve">)</m:t>
             </m:r>
           </m:e>
         </m:nary>
@@ -5033,7 +5033,7 @@
                   <w:rPr>
                     <w:rFonts w:ascii="Cambria Math" w:hAnsi="Cambria Math"/>
                   </w:rPr>
-                  <m:t xml:space="preserve">v</m:t>
+                  <m:t xml:space="preserve">v′</m:t>
                 </m:r>
               </m:sub>
             </m:sSub>
@@ -5041,7 +5041,7 @@
               <w:rPr>
                 <w:rFonts w:ascii="Cambria Math" w:hAnsi="Cambria Math"/>
               </w:rPr>
-              <m:t xml:space="preserve">′⟩/τ) + </m:t>
+              <m:t xml:space="preserve">⟩/τ) + </m:t>
             </m:r>
             <m:nary>
               <m:naryPr>
@@ -5154,16 +5154,10 @@
               <w:rPr>
                 <w:rFonts w:ascii="Cambria Math" w:hAnsi="Cambria Math"/>
               </w:rPr>
-              <m:t xml:space="preserve">v</m:t>
+              <m:t xml:space="preserve">v′</m:t>
             </m:r>
           </m:sub>
         </m:sSub>
-        <m:r>
-          <w:rPr>
-            <w:rFonts w:ascii="Cambria Math" w:hAnsi="Cambria Math"/>
-          </w:rPr>
-          <m:t xml:space="preserve">′</m:t>
-        </m:r>
       </m:oMath>
       <w:r>
         <w:t xml:space="preserve">, so the full set of weights, positive included, sums to one and the </w:t>
@@ -5234,7 +5228,7 @@
               <w:rPr>
                 <w:rFonts w:ascii="Cambria Math" w:hAnsi="Cambria Math"/>
               </w:rPr>
-              <m:t xml:space="preserve">v</m:t>
+              <m:t xml:space="preserve">v′</m:t>
             </m:r>
           </m:sub>
         </m:sSub>
@@ -5242,7 +5236,7 @@
           <w:rPr>
             <w:rFonts w:ascii="Cambria Math" w:hAnsi="Cambria Math"/>
           </w:rPr>
-          <m:t xml:space="preserve">′ = (</m:t>
+          <m:t xml:space="preserve"> = (</m:t>
         </m:r>
         <m:sSub>
           <m:e>
@@ -5330,7 +5324,7 @@
               <w:rPr>
                 <w:rFonts w:ascii="Cambria Math" w:hAnsi="Cambria Math"/>
               </w:rPr>
-              <m:t xml:space="preserve">v</m:t>
+              <m:t xml:space="preserve">v′</m:t>
             </m:r>
           </m:sub>
         </m:sSub>
@@ -5338,7 +5332,7 @@
           <w:rPr>
             <w:rFonts w:ascii="Cambria Math" w:hAnsi="Cambria Math"/>
           </w:rPr>
-          <m:t xml:space="preserve">′)</m:t>
+          <m:t xml:space="preserve">)</m:t>
         </m:r>
       </m:oMath>
       <w:r>
@@ -5412,16 +5406,10 @@
               <w:rPr>
                 <w:rFonts w:ascii="Cambria Math" w:hAnsi="Cambria Math"/>
               </w:rPr>
-              <m:t xml:space="preserve">v</m:t>
+              <m:t xml:space="preserve">v′</m:t>
             </m:r>
           </m:sub>
         </m:sSub>
-        <m:r>
-          <w:rPr>
-            <w:rFonts w:ascii="Cambria Math" w:hAnsi="Cambria Math"/>
-          </w:rPr>
-          <m:t xml:space="preserve">′</m:t>
-        </m:r>
         <m:sSup>
           <m:e>
             <m:r>
@@ -5774,7 +5762,7 @@
               <w:rPr>
                 <w:rFonts w:ascii="Cambria Math" w:hAnsi="Cambria Math"/>
               </w:rPr>
-              <m:t xml:space="preserve">v</m:t>
+              <m:t xml:space="preserve">v′</m:t>
             </m:r>
           </m:sub>
         </m:sSub>
@@ -5782,7 +5770,7 @@
           <w:rPr>
             <w:rFonts w:ascii="Cambria Math" w:hAnsi="Cambria Math"/>
           </w:rPr>
-          <m:t xml:space="preserve">′‖ ≫ ‖</m:t>
+          <m:t xml:space="preserve">‖ ≫ ‖</m:t>
         </m:r>
         <m:sSub>
           <m:e>
@@ -7186,16 +7174,10 @@
                   <w:rPr>
                     <w:rFonts w:ascii="Cambria Math" w:hAnsi="Cambria Math"/>
                   </w:rPr>
-                  <m:t xml:space="preserve">v</m:t>
+                  <m:t xml:space="preserve">v′</m:t>
                 </m:r>
               </m:sub>
             </m:sSub>
-            <m:r>
-              <w:rPr>
-                <w:rFonts w:ascii="Cambria Math" w:hAnsi="Cambria Math"/>
-              </w:rPr>
-              <m:t xml:space="preserve">′</m:t>
-            </m:r>
             <m:sSup>
               <m:e>
                 <m:r>
@@ -9260,7 +9242,7 @@
               <w:rPr>
                 <w:rFonts w:ascii="Cambria Math" w:hAnsi="Cambria Math"/>
               </w:rPr>
-              <m:t xml:space="preserve">v</m:t>
+              <m:t xml:space="preserve">v′</m:t>
             </m:r>
           </m:sub>
         </m:sSub>
@@ -9268,7 +9250,7 @@
           <w:rPr>
             <w:rFonts w:ascii="Cambria Math" w:hAnsi="Cambria Math"/>
           </w:rPr>
-          <m:t xml:space="preserve">′ ≈ J(</m:t>
+          <m:t xml:space="preserve"> ≈ J(</m:t>
         </m:r>
         <m:sSub>
           <m:e>
@@ -9308,7 +9290,7 @@
               <w:rPr>
                 <w:rFonts w:ascii="Cambria Math" w:hAnsi="Cambria Math"/>
               </w:rPr>
-              <m:t xml:space="preserve">v</m:t>
+              <m:t xml:space="preserve">v′</m:t>
             </m:r>
           </m:sub>
         </m:sSub>
@@ -9316,7 +9298,7 @@
           <w:rPr>
             <w:rFonts w:ascii="Cambria Math" w:hAnsi="Cambria Math"/>
           </w:rPr>
-          <m:t xml:space="preserve">′) → 0</m:t>
+          <m:t xml:space="preserve">) → 0</m:t>
         </m:r>
       </m:oMath>
       <w:r>
@@ -19296,7 +19278,7 @@
         <w:pStyle w:val="PostHeadPara"/>
       </w:pPr>
       <w:r>
-        <w:t xml:space="preserve">The tag probe of Section 5 is fit in one register and read in another, so its ranking of the towers mixes tag content with register transfer. Table A14 separates the two on the shipped rank-selected checkpoints, all five folds at the 4,096-sentence anchor budget, the only budget at which every tower of Table A3 exists (BYOL, the SimCLR-style arm and VICReg have no selected checkpoints at 512). The cross-register column is the shipped protocol unchanged: for each of the ten anchor draws behind Table A3, a ridge readout is fit on the 1,694 training-pool anchors (review register), its threshold is picked on validation-game anchors, and it is scored on the name-intact wiki-rewrite query vectors of the test games (document register), the ten micro-F1 values then averaged; recomputed from the shipped checkpoints, this column returns every tag entry of Table A3 exactly. The in-domain column changes one thing: the same ridge with the same threshold is scored on the test-game anchors of the same draw, so the two readings differ only in the register of the vectors read. Transfer loss is in-domain minus cross-register. The register offset is the norm of the mean anchor-to-query displacement over the training games of the fold that carry a wiki query (about 488 per fold), measured in the tower’s 128-d output space.</w:t>
+        <w:t xml:space="preserve">The tag probe of Section 5 is fit in one register and read in another, so its ranking of the towers mixes tag content with register transfer. Table A14 separates the two on the shipped rank-selected checkpoints, all five folds at the 4,096-sentence anchor budget, the only budget at which every tower of Table A3 exists (BYOL, the SimCLR-style arm and VICReg have no selected checkpoints at 512). The cross-register column is the shipped protocol unchanged: for each of the ten anchor draws behind Table A3, a ridge readout is fit on the 1,694 or 1,695 training-pool anchors (review register), its threshold is picked on validation-game anchors, and it is scored on the name-intact wiki-rewrite query vectors of the test games (document register), the ten micro-F1 values then averaged; recomputed from the shipped checkpoints, this column returns every tag entry of Table A3 exactly. The in-domain column changes one thing: the same ridge with the same threshold is scored on the test-game anchors of the same draw, so the two readings differ only in the register of the vectors read. Transfer loss is in-domain minus cross-register. The register offset is the norm of the mean anchor-to-query displacement over the training games of the fold that carry a wiki query (about 488 per fold), measured in the tower’s 128-d output space.</w:t>
       </w:r>
     </w:p>
     <w:p>
@@ -20540,7 +20522,7 @@
         <w:t xml:space="preserve">Why identity pressure costs transfer.</w:t>
       </w:r>
       <w:r>
-        <w:t xml:space="preserve"> Every anchor pack is a store-page prefix followed by reviews (Section 4.1), so the gallery an anchored objective repels against is review register in the main, and a game’s document view has to leave its own anchor’s neighborhood far enough to be told apart from the other 1,693 review anchors, most cheaply in a direction no review anchor occupies, orthogonal to the review manifold. The invariance term is the only force pulling that view back onto its anchor and it closes the gap only part of the way: I-CE reads tags in domain level with CE and above the three negative-light towers yet pays the second-largest transfer loss, while CE, with no invariance term, pays the largest loss and carries the largest offset. BYOL and VICReg never push a view away from a review anchor, so their two registers stay close and they lose least in transfer, which is how they win the shipped tag column while reading tags worst in domain; the SimCLR-style arm sits between the families, its in-batch negatives drawn from both registers, so its repulsion does not single out the document direction.</w:t>
+        <w:t xml:space="preserve"> Every anchor pack is a store-page prefix followed by reviews (Section 4.1), so the gallery an anchored objective repels against is review register in the main, and a game’s document view has to leave its own anchor’s neighborhood far enough to be told apart from the other 1,693 or 1,694 review anchors, most cheaply in a direction no review anchor occupies, orthogonal to the review manifold. The invariance term is the only force pulling that view back onto its anchor and it closes the gap only part of the way: I-CE reads tags in domain level with CE and above the three negative-light towers yet pays the second-largest transfer loss, while CE, with no invariance term, pays the largest loss and carries the largest offset. BYOL and VICReg never push a view away from a review anchor, so their two registers stay close and they lose least in transfer, which is how they win the shipped tag column while reading tags worst in domain; the SimCLR-style arm sits between the families, its in-batch negatives drawn from both registers, so its repulsion does not single out the document direction.</w:t>
       </w:r>
     </w:p>
     <w:p>

</xml_diff>

<commit_message>
Documents: appendix resynced after the redundancy trim
Co-Authored-By: Claude Fable 5.1 <noreply@anthropic.com>
</commit_message>
<xml_diff>
--- a/document/APPENDIX.docx
+++ b/document/APPENDIX.docx
@@ -86,7 +86,7 @@
         <w:pStyle w:val="TableCaption"/>
       </w:pPr>
       <w:r>
-        <w:t xml:space="preserve">Table A1: Per-fold detail at the 4,096-sentence anchor budget, test-set queries (ts). I-CE beats CE in five of five paired folds on both query registers at this budget, and on Stripped hit@1 in 20 of 20 across the four budgets of Table A2. Means and standard deviations are computed before rounding.</w:t>
+        <w:t xml:space="preserve">Table A1: Per-fold detail at the 4,096-sentence anchor budget, test-set queries (ts). I-CE beats CE in five of five paired folds on both query registers at this budget. Means and standard deviations are computed before rounding.</w:t>
       </w:r>
     </w:p>
     <w:tbl>
@@ -1297,7 +1297,7 @@
         </m:r>
       </m:oMath>
       <w:r>
-        <w:t xml:space="preserve">); I-CE leads CE at every budget (20 of 20 paired folds on Stripped hit@1), so the invariance constraint remains beneficial at all four scales. The windowed teacher (swin, Appendix J) appears at its trained budget.</w:t>
+        <w:t xml:space="preserve">); I-CE leads CE at every budget (20 of 20 paired folds on Stripped hit@1). The windowed teacher (swin, Appendix J) appears at its trained budget.</w:t>
       </w:r>
     </w:p>
     <w:tbl>
@@ -2275,18 +2275,7 @@
         <w:pStyle w:val="Para"/>
       </w:pPr>
       <w:r>
-        <w:t xml:space="preserve">Two facts hold at fold level. I-CE wins Stripped hit@1 in every fold at this budget and the tag reading rises with it in four folds of five, and the fold-to-fold spread reaches </w:t>
-      </w:r>
-      <m:oMath>
-        <m:r>
-          <w:rPr>
-            <w:rFonts w:ascii="Cambria Math" w:hAnsi="Cambria Math"/>
-          </w:rPr>
-          <m:t xml:space="preserve">±0.03</m:t>
-        </m:r>
-      </m:oMath>
-      <w:r>
-        <w:t xml:space="preserve"> on Stripped hit@1, the resolution below which this paper quotes no single-split difference anywhere. Table A13 in Appendix K repeats the fold-level detail at every budget, Table A7 tabulates the EMA + memory-bank variant, and Table A3 gives the full five-fold account of every objective family, the numbers the body’s Figure 4 plots.</w:t>
+        <w:t xml:space="preserve">Table A13 in Appendix K repeats the fold-level detail at every budget, Table A7 tabulates the EMA + memory-bank variant, and Table A3 gives the full five-fold account of every objective family, the numbers the body’s Figure 4 plots.</w:t>
       </w:r>
     </w:p>
     <w:p>
@@ -2305,7 +2294,7 @@
         </m:r>
       </m:oMath>
       <w:r>
-        <w:t xml:space="preserve">; zero-shot cosine retrieval among all 2,020 games; test-set tag micro-F1 under the held-out protocol of Section 5). Rows are sorted by Stripped hit@1, worst first; the first row is the no-tower baseline, the frozen embedder’s mean-pooled sentence vectors under the identical protocol. The two capabilities factorize: every negative-light objective lands in the same narrow tag band while conceding name-stripped retrieval, and I-CE is the only row that keeps name-stripped retrieval while reading tags above CE, at the 0.022–0.028 deficit to that band priced in Section 8.</w:t>
+        <w:t xml:space="preserve">; zero-shot cosine retrieval among all 2,020 games; test-set tag micro-F1 under the held-out protocol of Section 5). Rows are sorted by Stripped hit@1, worst first; the first row is the no-tower baseline, the frozen embedder’s mean-pooled sentence vectors under the identical protocol. The two capabilities factorize: every negative-light objective lands in the same narrow tag band while conceding name-stripped retrieval, and I-CE is the only row that keeps name-stripped retrieval while reading tags above CE.</w:t>
       </w:r>
     </w:p>
     <w:tbl>
@@ -10432,7 +10421,7 @@
         <w:pStyle w:val="PostHeadPara"/>
       </w:pPr>
       <w:r>
-        <w:t xml:space="preserve">This appendix locates the handover between the contrastive push-pull and the invariance term at the crossing of their maximum gradient magnitudes, with the empirically chosen </w:t>
+        <w:t xml:space="preserve">This appendix locates the handover between the contrastive push-pull and the invariance term, the crossing of their gradient envelopes that the empirically chosen </w:t>
       </w:r>
       <m:oMath>
         <m:r>
@@ -10454,7 +10443,7 @@
         </m:r>
       </m:oMath>
       <w:r>
-        <w:t xml:space="preserve"> placing that crossing at 99% confidence. Both envelopes are gradients with respect to the encodings, read as free variables as in Appendix D’s repulsion steps and taken with the tangential projection of the sphere so that they are commensurable; AdamW’s per-coordinate rescaling is not modeled.</w:t>
+        <w:t xml:space="preserve"> place at 99% confidence. Both envelopes are gradients with respect to the encodings, read as free variables as in Appendix D’s repulsion steps and taken with the tangential projection of the sphere so that they are commensurable; AdamW’s per-coordinate rescaling is not modeled.</w:t>
       </w:r>
     </w:p>
     <w:p>
@@ -11516,7 +11505,7 @@
         <w:pStyle w:val="PostHeadPara"/>
       </w:pPr>
       <w:r>
-        <w:t xml:space="preserve">Both query registers come from one chat-completions model that reads a held-out game’s full wiki article, truncated to 12,000 characters, and writes an English description of it: GPT-5.4-mini at temperature 0.7, called through an OpenAI-compatible gateway, the instructions below issued in Chinese and translated faithfully here, an output shorter than 300 characters re-requested with the elaboration instruction, which asks for at least 300 words and so for well more than the trigger requires, up to three attempts, and the verbatim strings and the retry policy in the released code. The name-stripped instruction asks for invented replacement names, but the model complies literally in only 113 of the 814 queries and generalizes the name away in the other 701, so the register is better read as name-free than as name-substituted.</w:t>
+        <w:t xml:space="preserve">Each query is an English description that GPT-5.4-mini at temperature 0.7 writes from the held-out game’s full wiki article, truncated to 12,000 characters, called through an OpenAI-compatible gateway; the instructions below were issued in Chinese and are translated faithfully here, an output shorter than 300 characters re-requested with the elaboration instruction, which asks for at least 300 words and so for well more than the trigger requires, up to three attempts, and the verbatim strings and the retry policy in the released code. The name-stripped instruction asks for invented replacement names, but the model complies literally in only 113 of the 814 queries and generalizes the name away in the other 701, so the register is better read as name-free than as name-substituted.</w:t>
       </w:r>
     </w:p>
     <w:p>
@@ -12270,7 +12259,7 @@
         <w:pStyle w:val="Para"/>
       </w:pPr>
       <w:r>
-        <w:t xml:space="preserve">At 1,024 sentences the tower is already inside the indistinguishable band of Table A2: every retrieval and tag reading stays within 0.02 of the 4,096-sentence recipe at a peak 2.7× smaller. That peak fits the 24 GB of a consumer card, an RTX 3090 or 4090, which puts a reproduction of this paper within reach of a single desktop GPU; the 22.3 GiB leaves little headroom, so such a card should be running headless.</w:t>
+        <w:t xml:space="preserve">At 1,024 sentences, the plateau of Table A2, every retrieval and tag reading stays within 0.02 of the 4,096-sentence recipe at a peak 2.7× smaller, which fits the 24 GB of an RTX 3090 or 4090; the 22.3 GiB leaves little headroom, so such a card should be running headless.</w:t>
       </w:r>
     </w:p>
     <w:p>
@@ -14147,7 +14136,7 @@
         <w:pStyle w:val="TableCaption"/>
       </w:pPr>
       <w:r>
-        <w:t xml:space="preserve">Table A7: The cost of the anchor-supply economies (test-set queries (ts), five-fold mean ± std at the 4,096-sentence anchor budget). The sliding fresh-window variant (swin, Appendix J) re-encodes ~26% of the five-fold gallery with gradient per step (27% on the fixed split of Appendix J); the two-stage row hands a BYOL warm start to the windowed teacher for the last 600 epochs; the EMA + memory-bank variant replaces the coupled teacher with an EMA shadow encoder feeding a 3,072-key bank (Appendix C). Full coupling is the ceiling: the windowed teacher and the two-stage recipe each give up 0.032 Stripped hit@1, the memory-bank economy 0.105.</w:t>
+        <w:t xml:space="preserve">Table A7: The cost of the anchor-supply economies (test-set queries (ts), five-fold mean ± std at the 4,096-sentence anchor budget). The sliding fresh-window variant (swin, Appendix J) re-encodes ~26% of the five-fold gallery with gradient per step (27% on the fixed split of Appendix J); the two-stage row hands a BYOL warm start to the windowed teacher for the last 600 epochs; the EMA + memory-bank variant replaces the coupled teacher with an EMA shadow encoder feeding a 3,072-key bank (Appendix C).</w:t>
       </w:r>
     </w:p>
     <w:tbl>
@@ -16420,7 +16409,40 @@
         <w:pStyle w:val="Para"/>
       </w:pPr>
       <w:r>
-        <w:t xml:space="preserve">The temperature sweep of Table A12 is five-fold and carries the Section 8 verdict directly.</w:t>
+        <w:t xml:space="preserve">The temperature sweep of Table A12 is five-fold and carries the Section 8 verdict directly. The learnable variant (initialized at 0.02, </w:t>
+      </w:r>
+      <m:oMath>
+        <m:r>
+          <w:rPr>
+            <w:rFonts w:ascii="Cambria Math" w:hAnsi="Cambria Math"/>
+          </w:rPr>
+          <m:t xml:space="preserve">τ</m:t>
+        </m:r>
+      </m:oMath>
+      <w:r>
+        <w:t xml:space="preserve"> clamped to </w:t>
+      </w:r>
+      <m:oMath>
+        <m:r>
+          <w:rPr>
+            <w:rFonts w:ascii="Cambria Math" w:hAnsi="Cambria Math"/>
+          </w:rPr>
+          <m:t xml:space="preserve">[0.005, 0.2]</m:t>
+        </m:r>
+      </m:oMath>
+      <w:r>
+        <w:t xml:space="preserve">) never settles at an interior optimum: in all five folds it sharpens monotonically to the clamp floor within 250 epochs and trains there, an effective fixed </w:t>
+      </w:r>
+      <m:oMath>
+        <m:r>
+          <w:rPr>
+            <w:rFonts w:ascii="Cambria Math" w:hAnsi="Cambria Math"/>
+          </w:rPr>
+          <m:t xml:space="preserve">τ = 0.005</m:t>
+        </m:r>
+      </m:oMath>
+      <w:r>
+        <w:t xml:space="preserve">, beating the frozen recipe by 0.010 Stripped hit@1 in five folds of five and by 0.008 on tags (computed before rounding), the sharp-side headroom that the frozen setting of Section 4.2 leaves to deployment.</w:t>
       </w:r>
     </w:p>
     <w:p>
@@ -16461,40 +16483,7 @@
         </m:r>
       </m:oMath>
       <w:r>
-        <w:t xml:space="preserve"> lifts it to the edge of the negative-light band of Section 6.1, so on the soft side temperature trades the tag reading against identity. The learnable variant (initialized at 0.02, </w:t>
-      </w:r>
-      <m:oMath>
-        <m:r>
-          <w:rPr>
-            <w:rFonts w:ascii="Cambria Math" w:hAnsi="Cambria Math"/>
-          </w:rPr>
-          <m:t xml:space="preserve">τ</m:t>
-        </m:r>
-      </m:oMath>
-      <w:r>
-        <w:t xml:space="preserve"> clamped to </w:t>
-      </w:r>
-      <m:oMath>
-        <m:r>
-          <w:rPr>
-            <w:rFonts w:ascii="Cambria Math" w:hAnsi="Cambria Math"/>
-          </w:rPr>
-          <m:t xml:space="preserve">[0.005, 0.2]</m:t>
-        </m:r>
-      </m:oMath>
-      <w:r>
-        <w:t xml:space="preserve">) never settles at an interior optimum: in all five folds it sharpens monotonically to the clamp floor within 250 epochs and trains there, an effective fixed </w:t>
-      </w:r>
-      <m:oMath>
-        <m:r>
-          <w:rPr>
-            <w:rFonts w:ascii="Cambria Math" w:hAnsi="Cambria Math"/>
-          </w:rPr>
-          <m:t xml:space="preserve">τ = 0.005</m:t>
-        </m:r>
-      </m:oMath>
-      <w:r>
-        <w:t xml:space="preserve">, beating the frozen recipe by 0.010 Stripped hit@1 in five folds of five and by 0.008 on tags, both computed before rounding, the sharp-side headroom that the frozen setting of Section 4.2 leaves to deployment.</w:t>
+        <w:t xml:space="preserve"> lifts it to the edge of the negative-light band of Section 6.1, so on the soft side temperature trades the tag reading against identity.</w:t>
       </w:r>
     </w:p>
     <w:tbl>
@@ -17372,7 +17361,7 @@
         <w:pStyle w:val="PostHeadPara"/>
       </w:pPr>
       <w:r>
-        <w:t xml:space="preserve">Table A13 gives, fold by fold, the two numbers the body quotes across budgets: the name-stripped retrieval that I-CE wins in every paired fold (15 of 15 at the three smaller budgets in Section 6.1, 20 of 20 with the 4,096-sentence rows of Table A1 included) and the tag reading, where the pairing is less one-sided. Values at 512 to 2,048 sentences are the ten-draw means behind Table A2; the 4,096-sentence rows are the ten-draw means behind Tables A1 and A3. The two objectives are seed-paired on identical splits, so each column is a paired comparison.</w:t>
+        <w:t xml:space="preserve">Table A13 gives, fold by fold, the two numbers the body quotes across budgets. Values at 512 to 2,048 sentences are the ten-draw means behind Table A2, the 4,096-sentence rows those behind Tables A1 and A3; the two objectives are seed-paired on identical splits, so each column is a paired comparison.</w:t>
       </w:r>
     </w:p>
     <w:p>

</xml_diff>